<commit_message>
Update Ukrainian thesis deliverables
- Updated the Ukrainian thesis DOCX deliverable with the latest translated documentation content.
- Regenerated the matching Ukrainian PDF so the exported artifact stays in sync with the source document.
</commit_message>
<xml_diff>
--- a/documentation/ua/2026_Б_ШІ_ІТШІз-22-1_Абросімов_В_П_записка.docx
+++ b/documentation/ua/2026_Б_ШІ_ІТШІз-22-1_Абросімов_В_П_записка.docx
@@ -19040,430 +19040,319 @@
         <w:rPr>
           <w:lang w:val="ru-RU"/>
         </w:rPr>
-        <w:lastRenderedPageBreak/>
-        <w:t xml:space="preserve">Для підвищення довіри до результатів аналізу доцільно зберігати короткий технічний журнал виконання запиту. До нього можуть входити ідентифікатор моделі, версія адаптера, час відповіді, ознака успішної </w:t>
-      </w:r>
-      <w:r>
-        <w:t>JSON</w:t>
-      </w:r>
-      <w:r>
-        <w:rPr>
-          <w:lang w:val="ru-RU"/>
-        </w:rPr>
-        <w:t>-валидації та перелік застосованих нормалізацій. Такий журнал потрібен не кінцевому користувачу, а розробнику й експерту для відтворення помилок.</w:t>
-      </w:r>
-    </w:p>
-    <w:p>
-      <w:pPr>
-        <w:rPr>
-          <w:lang w:val="ru-RU"/>
-        </w:rPr>
-      </w:pPr>
-      <w:r>
-        <w:rPr>
-          <w:lang w:val="ru-RU"/>
-        </w:rPr>
-        <w:t xml:space="preserve">Додатковим критерієм практичної готовності є зручність відтворення експериментів. У роботі важливо фіксувати не тільки фінальні метрики, а й умови їх отримання: версію датасету, назву адаптера, параметри генерації, спосіб нормалізації відповіді і дату запуску </w:t>
-      </w:r>
-      <w:r>
-        <w:t>benchmark</w:t>
-      </w:r>
-      <w:r>
-        <w:rPr>
-          <w:lang w:val="ru-RU"/>
-        </w:rPr>
-        <w:t>. Без цього однакові числові значення важко порівнювати між ітераціями.</w:t>
-      </w:r>
-    </w:p>
-    <w:p>
-      <w:pPr>
-        <w:rPr>
-          <w:lang w:val="ru-RU"/>
-        </w:rPr>
-      </w:pPr>
-      <w:r>
-        <w:rPr>
-          <w:lang w:val="ru-RU"/>
-        </w:rPr>
-        <w:t xml:space="preserve">Під час аналізу тестів було враховано, що </w:t>
-      </w:r>
-      <w:r>
-        <w:t>integration</w:t>
-      </w:r>
-      <w:r>
-        <w:rPr>
-          <w:lang w:val="ru-RU"/>
-        </w:rPr>
-        <w:t xml:space="preserve">-перевірки мають залежності від зовнішнього локального стану: </w:t>
-      </w:r>
-      <w:r>
-        <w:t>Ollama</w:t>
-      </w:r>
-      <w:r>
-        <w:rPr>
-          <w:lang w:val="ru-RU"/>
-        </w:rPr>
-        <w:t xml:space="preserve">, </w:t>
-      </w:r>
-      <w:r>
-        <w:t>WSL</w:t>
-      </w:r>
-      <w:r>
-        <w:rPr>
-          <w:lang w:val="ru-RU"/>
-        </w:rPr>
-        <w:t xml:space="preserve">2, </w:t>
-      </w:r>
-      <w:r>
-        <w:t>WebSocket</w:t>
-      </w:r>
-      <w:r>
-        <w:rPr>
-          <w:lang w:val="ru-RU"/>
-        </w:rPr>
-        <w:t xml:space="preserve"> і встановленої моделі. Тому вони позначені окремими маркерами і повинні пропускатися з явними причинами, якщо передумови відсутні. Це правильна стратегія для проєктів, де частина функцій залежить від важких сервісів.</w:t>
-      </w:r>
-    </w:p>
-    <w:p>
-      <w:pPr>
-        <w:rPr>
-          <w:lang w:val="ru-RU"/>
-        </w:rPr>
-      </w:pPr>
-      <w:r>
-        <w:rPr>
-          <w:lang w:val="ru-RU"/>
-        </w:rPr>
-        <w:t xml:space="preserve">Особливу увагу потрібно приділяти регресіям у нормалізації відповідей. Навіть невелика зміна у промпті або адаптері може збільшити кількість невалідних ключів. </w:t>
-      </w:r>
-      <w:r>
-        <w:t>Unit</w:t>
-      </w:r>
-      <w:r>
-        <w:rPr>
-          <w:lang w:val="ru-RU"/>
-        </w:rPr>
-        <w:t xml:space="preserve">-тести </w:t>
-      </w:r>
-      <w:r>
-        <w:t>normalize</w:t>
-      </w:r>
-      <w:r>
-        <w:rPr>
-          <w:lang w:val="ru-RU"/>
-        </w:rPr>
-        <w:t>_</w:t>
-      </w:r>
-      <w:r>
-        <w:t>llm</w:t>
-      </w:r>
-      <w:r>
-        <w:rPr>
-          <w:lang w:val="ru-RU"/>
-        </w:rPr>
-        <w:t>_</w:t>
-      </w:r>
-      <w:r>
-        <w:t>response</w:t>
-      </w:r>
-      <w:r>
-        <w:rPr>
-          <w:lang w:val="ru-RU"/>
-        </w:rPr>
-        <w:t xml:space="preserve"> виконують роль запобіжника: вони фіксують очікувану поведінку для валідного </w:t>
-      </w:r>
-      <w:r>
-        <w:t>JSON</w:t>
-      </w:r>
-      <w:r>
-        <w:rPr>
-          <w:lang w:val="ru-RU"/>
-        </w:rPr>
-        <w:t xml:space="preserve">, </w:t>
-      </w:r>
-      <w:r>
-        <w:t>fuzzy</w:t>
-      </w:r>
-      <w:r>
-        <w:rPr>
-          <w:lang w:val="ru-RU"/>
-        </w:rPr>
-        <w:t xml:space="preserve"> </w:t>
-      </w:r>
-      <w:r>
-        <w:t>keys</w:t>
-      </w:r>
-      <w:r>
-        <w:rPr>
-          <w:lang w:val="ru-RU"/>
-        </w:rPr>
-        <w:t xml:space="preserve"> і </w:t>
-      </w:r>
-      <w:r>
-        <w:t>regex</w:t>
-      </w:r>
-      <w:r>
-        <w:rPr>
-          <w:lang w:val="ru-RU"/>
-        </w:rPr>
-        <w:t xml:space="preserve"> </w:t>
-      </w:r>
-      <w:r>
-        <w:t>recovery</w:t>
-      </w:r>
-      <w:r>
-        <w:rPr>
-          <w:lang w:val="ru-RU"/>
-        </w:rPr>
-        <w:t>.</w:t>
-      </w:r>
-    </w:p>
-    <w:p>
-      <w:pPr>
-        <w:rPr>
-          <w:lang w:val="ru-RU"/>
-        </w:rPr>
-      </w:pPr>
-      <w:r>
-        <w:rPr>
-          <w:lang w:val="ru-RU"/>
-        </w:rPr>
-        <w:t xml:space="preserve">З погляду якості програмного забезпечення корисно розширити автоматичні тести на типові помилки </w:t>
-      </w:r>
-      <w:r>
-        <w:t>LLM</w:t>
-      </w:r>
-      <w:r>
-        <w:rPr>
-          <w:lang w:val="ru-RU"/>
-        </w:rPr>
-        <w:t xml:space="preserve">-відповідей: зайві </w:t>
-      </w:r>
-      <w:r>
-        <w:t>Markdown</w:t>
-      </w:r>
-      <w:r>
-        <w:rPr>
-          <w:lang w:val="ru-RU"/>
-        </w:rPr>
-        <w:t xml:space="preserve">-блоки, текст перед </w:t>
-      </w:r>
-      <w:r>
-        <w:t>JSON</w:t>
-      </w:r>
-      <w:r>
-        <w:rPr>
-          <w:lang w:val="ru-RU"/>
-        </w:rPr>
-        <w:t xml:space="preserve">, неправильні лапки, невідомі теги, порожні поля </w:t>
-      </w:r>
-      <w:r>
-        <w:t>reasoning</w:t>
-      </w:r>
-      <w:r>
-        <w:rPr>
-          <w:lang w:val="ru-RU"/>
-        </w:rPr>
-        <w:t xml:space="preserve">, надто довгі </w:t>
-      </w:r>
-      <w:r>
-        <w:t>explanations</w:t>
-      </w:r>
-      <w:r>
-        <w:rPr>
-          <w:lang w:val="ru-RU"/>
-        </w:rPr>
-        <w:t xml:space="preserve">. Частина таких випадків уже врахована нормалізацією, але систематизований набір </w:t>
-      </w:r>
-      <w:r>
-        <w:t>regression</w:t>
-      </w:r>
-      <w:r>
-        <w:rPr>
-          <w:lang w:val="ru-RU"/>
-        </w:rPr>
-        <w:t xml:space="preserve"> </w:t>
-      </w:r>
-      <w:r>
-        <w:t>tests</w:t>
-      </w:r>
-      <w:r>
-        <w:rPr>
-          <w:lang w:val="ru-RU"/>
-        </w:rPr>
-        <w:t xml:space="preserve"> допоможе не втратити ці гарантії під час зміни промпта або моделі.</w:t>
-      </w:r>
-    </w:p>
-    <w:p>
-      <w:pPr>
-        <w:rPr>
-          <w:lang w:val="ru-RU"/>
-        </w:rPr>
-      </w:pPr>
-      <w:r>
-        <w:rPr>
-          <w:lang w:val="ru-RU"/>
-        </w:rPr>
-        <w:t xml:space="preserve">З погляду безпеки важливо враховувати </w:t>
-      </w:r>
-      <w:r>
-        <w:t>prompt</w:t>
-      </w:r>
-      <w:r>
-        <w:rPr>
-          <w:lang w:val="ru-RU"/>
-        </w:rPr>
-        <w:t xml:space="preserve"> </w:t>
-      </w:r>
-      <w:r>
-        <w:t>injection</w:t>
-      </w:r>
-      <w:r>
-        <w:rPr>
-          <w:lang w:val="ru-RU"/>
-        </w:rPr>
-        <w:t xml:space="preserve">. Медіатекст може містити інструкції, що намагаються змінити поведінку </w:t>
-      </w:r>
-      <w:r>
-        <w:t>LLM</w:t>
-      </w:r>
-      <w:r>
-        <w:rPr>
-          <w:lang w:val="ru-RU"/>
-        </w:rPr>
-        <w:t xml:space="preserve">: </w:t>
-      </w:r>
-      <w:r>
-        <w:rPr>
-          <w:lang w:val="ru-RU"/>
-        </w:rPr>
-        <w:lastRenderedPageBreak/>
-        <w:t xml:space="preserve">наприклад, прохання ігнорувати попередні правила або повернути відповідь у довільному форматі. Для такого сценарію системний </w:t>
-      </w:r>
-      <w:r>
-        <w:t>prompt</w:t>
-      </w:r>
-      <w:r>
-        <w:rPr>
-          <w:lang w:val="ru-RU"/>
-        </w:rPr>
-        <w:t xml:space="preserve">, </w:t>
-      </w:r>
-      <w:r>
-        <w:t>JSON</w:t>
-      </w:r>
-      <w:r>
-        <w:rPr>
-          <w:lang w:val="ru-RU"/>
-        </w:rPr>
-        <w:t>-схема, післяобробка і валідація є не лише технічними зручностями, а й елементами захисту від маніпуляції самим інструментом аналізу.</w:t>
-      </w:r>
-    </w:p>
-    <w:p>
-      <w:pPr>
-        <w:rPr>
-          <w:lang w:val="ru-RU"/>
-        </w:rPr>
-      </w:pPr>
-      <w:r>
-        <w:rPr>
-          <w:lang w:val="ru-RU"/>
-        </w:rPr>
-        <w:t xml:space="preserve">На </w:t>
-      </w:r>
-      <w:r>
-        <w:t>backend</w:t>
-      </w:r>
-      <w:r>
-        <w:rPr>
-          <w:lang w:val="ru-RU"/>
-        </w:rPr>
-        <w:t xml:space="preserve">-рівні перспективним є впровадження строгого </w:t>
-      </w:r>
-      <w:r>
-        <w:t>JSON</w:t>
-      </w:r>
-      <w:r>
-        <w:rPr>
-          <w:lang w:val="ru-RU"/>
-        </w:rPr>
-        <w:t xml:space="preserve"> </w:t>
-      </w:r>
-      <w:r>
-        <w:t>Schema</w:t>
-      </w:r>
-      <w:r>
-        <w:rPr>
-          <w:lang w:val="ru-RU"/>
-        </w:rPr>
-        <w:t xml:space="preserve"> і автоматичного </w:t>
-      </w:r>
-      <w:r>
-        <w:t>repair</w:t>
-      </w:r>
-      <w:r>
-        <w:rPr>
-          <w:lang w:val="ru-RU"/>
-        </w:rPr>
-        <w:t xml:space="preserve">-механізму з обмеженням допустимих тегів. Поточні евристики вже покривають типові помилки, але схема дозволила б формально відокремити структурну помилку від класифікаційної. Це покращить </w:t>
-      </w:r>
-      <w:r>
-        <w:t>benchmark</w:t>
-      </w:r>
-      <w:r>
-        <w:rPr>
-          <w:lang w:val="ru-RU"/>
-        </w:rPr>
-        <w:t xml:space="preserve"> і спростить журналювання.</w:t>
-      </w:r>
-    </w:p>
-    <w:p>
-      <w:pPr>
-        <w:rPr>
-          <w:lang w:val="ru-RU"/>
-        </w:rPr>
-      </w:pPr>
-      <w:r>
-        <w:rPr>
-          <w:lang w:val="ru-RU"/>
-        </w:rPr>
-        <w:t xml:space="preserve">На рівні контролю якості окремо перевірявся інженерний контракт між моделлю і </w:t>
-      </w:r>
-      <w:r>
-        <w:t>backend</w:t>
-      </w:r>
-      <w:r>
-        <w:rPr>
-          <w:lang w:val="ru-RU"/>
-        </w:rPr>
-        <w:t xml:space="preserve">-сервісом. У системах з </w:t>
-      </w:r>
-      <w:r>
-        <w:t>LLM</w:t>
-      </w:r>
-      <w:r>
-        <w:rPr>
-          <w:lang w:val="ru-RU"/>
-        </w:rPr>
-        <w:t xml:space="preserve"> цей контракт є не менш важливим за </w:t>
-      </w:r>
-      <w:r>
-        <w:t>prompt</w:t>
-      </w:r>
-      <w:r>
-        <w:rPr>
-          <w:lang w:val="ru-RU"/>
-        </w:rPr>
-        <w:t xml:space="preserve">, оскільки саме він визначає, які дані можуть бути безпечно передані до інтерфейсу користувача. Якщо модель повертає довільний текст, </w:t>
-      </w:r>
-      <w:r>
-        <w:t>frontend</w:t>
-      </w:r>
-      <w:r>
-        <w:rPr>
-          <w:lang w:val="ru-RU"/>
-        </w:rPr>
-        <w:t xml:space="preserve"> не має надійного способу відобразити результат, тому нормалізація, валідація і локалізація тегів розглядаються як частина якості системи.</w:t>
+        <w:t>Для контролю достовірності результатів доцільно фіксувати не лише відповідь моделі, а й технічний контекст її отримання. Мінімальний журнал запиту може містити ідентифікатор запуску, назву активного адаптера, довжину вхідного тексту, час відповіді, режим обробки відповіді та ознаку застосованих відновлень. Такий журнал не призначений для кінцевого користувача, але потрібний розробнику й експерту для відтворення помилок.</w:t>
+      </w:r>
+      <w:r/>
+      <w:r>
+        <w:rPr>
+          <w:lang w:val="ru-RU"/>
+        </w:rPr>
+      </w:r>
+    </w:p>
+    <w:p>
+      <w:pPr>
+        <w:rPr>
+          <w:lang w:val="ru-RU"/>
+        </w:rPr>
+      </w:pPr>
+      <w:r>
+        <w:rPr>
+          <w:lang w:val="ru-RU"/>
+        </w:rPr>
+        <w:t>Окремим критерієм практичної готовності є відтворюваність експериментів. Для кожного benchmark-запуску варто зберігати версію датасету, назву адаптера, параметри інференсу, дату запуску, розмір тестової вибірки та спосіб агрегації метрик. Без такого опису однакові числові значення важко порівнювати між ітераціями, а покращення моделі може бути випадковим наслідком зміни умов оцінювання.</w:t>
+      </w:r>
+      <w:r/>
+      <w:r>
+        <w:rPr>
+          <w:lang w:val="ru-RU"/>
+        </w:rPr>
+      </w:r>
+    </w:p>
+    <w:p>
+      <w:pPr>
+        <w:rPr>
+          <w:lang w:val="ru-RU"/>
+        </w:rPr>
+      </w:pPr>
+      <w:r>
+        <w:rPr>
+          <w:lang w:val="ru-RU"/>
+        </w:rPr>
+        <w:t>Під час аналізу тестів було враховано, що частина перевірок залежить від локальної інфраструктури: Ollama, WSL2, WebSocket-з’єднання і встановленої моделі. Тому integration-тести позначені окремими маркерами і мають пропускатися з явними причинами, якщо передумови відсутні. Така організація дозволяє відокремити помилку коду від відсутності зовнішнього сервісу.</w:t>
+      </w:r>
+      <w:r/>
+      <w:r>
+        <w:rPr>
+          <w:lang w:val="ru-RU"/>
+        </w:rPr>
+      </w:r>
+      <w:r/>
+      <w:r>
+        <w:rPr>
+          <w:lang w:val="ru-RU"/>
+        </w:rPr>
+      </w:r>
+      <w:r/>
+      <w:r>
+        <w:rPr>
+          <w:lang w:val="ru-RU"/>
+        </w:rPr>
+      </w:r>
+      <w:r/>
+      <w:r>
+        <w:rPr>
+          <w:lang w:val="ru-RU"/>
+        </w:rPr>
+      </w:r>
+    </w:p>
+    <w:p>
+      <w:pPr>
+        <w:rPr>
+          <w:lang w:val="ru-RU"/>
+        </w:rPr>
+      </w:pPr>
+      <w:r>
+        <w:rPr>
+          <w:lang w:val="ru-RU"/>
+        </w:rPr>
+        <w:t>Unit-тести мають покривати насамперед чисті функції та інженерні контракти: перетворення шляхів Windows у WSL, читання baseline-звітів, оновлення станів MLOps-циклу, локалізацію тегів і підготовку результату для frontend. Саме ці частини можна перевіряти детерміновано без запуску великої мовної моделі, тому вони є основою швидкого регресійного контролю.</w:t>
+      </w:r>
+      <w:r/>
+      <w:r>
+        <w:rPr>
+          <w:lang w:val="ru-RU"/>
+        </w:rPr>
+      </w:r>
+      <w:r/>
+      <w:r>
+        <w:rPr>
+          <w:lang w:val="ru-RU"/>
+        </w:rPr>
+      </w:r>
+      <w:r/>
+      <w:r>
+        <w:rPr>
+          <w:lang w:val="ru-RU"/>
+        </w:rPr>
+      </w:r>
+      <w:r/>
+      <w:r>
+        <w:rPr>
+          <w:lang w:val="ru-RU"/>
+        </w:rPr>
+      </w:r>
+      <w:r/>
+      <w:r>
+        <w:rPr>
+          <w:lang w:val="ru-RU"/>
+        </w:rPr>
+      </w:r>
+      <w:r/>
+      <w:r>
+        <w:rPr>
+          <w:lang w:val="ru-RU"/>
+        </w:rPr>
+      </w:r>
+      <w:r/>
+      <w:r>
+        <w:rPr>
+          <w:lang w:val="ru-RU"/>
+        </w:rPr>
+      </w:r>
+      <w:r/>
+      <w:r>
+        <w:rPr>
+          <w:lang w:val="ru-RU"/>
+        </w:rPr>
+      </w:r>
+      <w:r/>
+      <w:r>
+        <w:rPr>
+          <w:lang w:val="ru-RU"/>
+        </w:rPr>
+      </w:r>
+    </w:p>
+    <w:p>
+      <w:pPr>
+        <w:rPr>
+          <w:lang w:val="ru-RU"/>
+        </w:rPr>
+      </w:pPr>
+      <w:r>
+        <w:rPr>
+          <w:lang w:val="ru-RU"/>
+        </w:rPr>
+        <w:t>Для повнішого контролю якості доцільно розширити набір тестових вхідних даних. Окремо мають перевірятися порожній текст, дуже довгий матеріал, текст із кількома мовами, нестандартні лапки, Markdown-фрагменти, URL-адреси, а також випадки паралельної роботи користувача й експерта. Це дозволить виявити дефекти інтерфейсу та backend-обробки до того, як вони проявляться під час демонстрації.</w:t>
+      </w:r>
+      <w:r/>
+      <w:r>
+        <w:rPr>
+          <w:lang w:val="ru-RU"/>
+        </w:rPr>
+      </w:r>
+      <w:r/>
+      <w:r>
+        <w:rPr>
+          <w:lang w:val="ru-RU"/>
+        </w:rPr>
+      </w:r>
+      <w:r/>
+      <w:r>
+        <w:rPr>
+          <w:lang w:val="ru-RU"/>
+        </w:rPr>
+      </w:r>
+      <w:r/>
+      <w:r>
+        <w:rPr>
+          <w:lang w:val="ru-RU"/>
+        </w:rPr>
+      </w:r>
+      <w:r/>
+      <w:r>
+        <w:rPr>
+          <w:lang w:val="ru-RU"/>
+        </w:rPr>
+      </w:r>
+      <w:r/>
+      <w:r>
+        <w:rPr>
+          <w:lang w:val="ru-RU"/>
+        </w:rPr>
+      </w:r>
+      <w:r/>
+      <w:r>
+        <w:rPr>
+          <w:lang w:val="ru-RU"/>
+        </w:rPr>
+      </w:r>
+    </w:p>
+    <w:p>
+      <w:pPr>
+        <w:rPr>
+          <w:lang w:val="ru-RU"/>
+        </w:rPr>
+      </w:pPr>
+      <w:r>
+        <w:rPr>
+          <w:lang w:val="ru-RU"/>
+        </w:rPr>
+        <w:t>З погляду безпеки важливо враховувати prompt injection як частину тестового набору. Медіатекст може містити інструкції на кшталт прохання ігнорувати попередні правила або повернути відповідь в іншому форматі. Для такого сценарію перевіряється не лише результат класифікації, а й здатність системи зберегти службовий контракт між backend, моделлю та frontend.</w:t>
+      </w:r>
+      <w:r/>
+      <w:r>
+        <w:rPr>
+          <w:lang w:val="ru-RU"/>
+        </w:rPr>
+      </w:r>
+      <w:r/>
+      <w:r>
+        <w:rPr>
+          <w:lang w:val="ru-RU"/>
+        </w:rPr>
+      </w:r>
+      <w:r/>
+      <w:r>
+        <w:rPr>
+          <w:lang w:val="ru-RU"/>
+        </w:rPr>
+      </w:r>
+      <w:r>
+        <w:rPr>
+          <w:lang w:val="ru-RU"/>
+        </w:rPr>
+      </w:r>
+      <w:r/>
+      <w:r>
+        <w:rPr>
+          <w:lang w:val="ru-RU"/>
+        </w:rPr>
+      </w:r>
+      <w:r/>
+      <w:r>
+        <w:rPr>
+          <w:lang w:val="ru-RU"/>
+        </w:rPr>
+      </w:r>
+    </w:p>
+    <w:p>
+      <w:pPr>
+        <w:rPr>
+          <w:lang w:val="ru-RU"/>
+        </w:rPr>
+      </w:pPr>
+      <w:r>
+        <w:rPr>
+          <w:lang w:val="ru-RU"/>
+        </w:rPr>
+        <w:t>Для тренувального контуру корисним є окремий аудит дій експерта. Запис TrainingRun має пов’язувати завантажений JSONL-файл, його контрольну суму, шлях до кандидата-адаптера, baseline-метрики, нові метрики та рішення promote або reject. Це створює мінімальну історію походження моделі, яка потрібна для пояснення, чому саме певний адаптер став активним.</w:t>
+      </w:r>
+      <w:r/>
+      <w:r>
+        <w:rPr>
+          <w:lang w:val="ru-RU"/>
+        </w:rPr>
+      </w:r>
+      <w:r/>
+      <w:r>
+        <w:rPr>
+          <w:lang w:val="ru-RU"/>
+        </w:rPr>
+      </w:r>
+      <w:r/>
+      <w:r>
+        <w:rPr>
+          <w:lang w:val="ru-RU"/>
+        </w:rPr>
+      </w:r>
+      <w:r/>
+      <w:r>
+        <w:rPr>
+          <w:lang w:val="ru-RU"/>
+        </w:rPr>
+      </w:r>
+      <w:r/>
+      <w:r>
+        <w:rPr>
+          <w:lang w:val="ru-RU"/>
+        </w:rPr>
+      </w:r>
+    </w:p>
+    <w:p>
+      <w:pPr>
+        <w:rPr>
+          <w:lang w:val="ru-RU"/>
+        </w:rPr>
+      </w:pPr>
+      <w:r>
+        <w:rPr>
+          <w:lang w:val="ru-RU"/>
+        </w:rPr>
+        <w:t>На рівні контролю якості окремо перевірявся інженерний контракт між моделлю і backend-сервісом. Для LLM-систем він є не менш важливим за сам prompt, оскільки визначає, які дані можуть бути безпечно передані до інтерфейсу користувача, збережені у журналі та використані в наступному MLOps-циклі.</w:t>
+      </w:r>
+      <w:r/>
+      <w:r>
+        <w:rPr>
+          <w:lang w:val="ru-RU"/>
+        </w:rPr>
+      </w:r>
+      <w:r/>
+      <w:r>
+        <w:rPr>
+          <w:lang w:val="ru-RU"/>
+        </w:rPr>
+      </w:r>
+      <w:r/>
+      <w:r>
+        <w:rPr>
+          <w:lang w:val="ru-RU"/>
+        </w:rPr>
+      </w:r>
+      <w:r/>
+      <w:r>
+        <w:rPr>
+          <w:lang w:val="ru-RU"/>
+        </w:rPr>
       </w:r>
     </w:p>
     <w:p>
@@ -22599,235 +22488,172 @@
         <w:rPr>
           <w:lang w:val="ru-RU"/>
         </w:rPr>
-        <w:t xml:space="preserve">Під час аналізу архітектури було враховано, що модельні файли мають значний розмір і не повинні зберігатися у звичайному репозиторії. Тому </w:t>
-      </w:r>
-      <w:r>
-        <w:t>README</w:t>
-      </w:r>
-      <w:r>
-        <w:rPr>
-          <w:lang w:val="ru-RU"/>
-        </w:rPr>
-        <w:t>.</w:t>
-      </w:r>
-      <w:r>
-        <w:t>md</w:t>
-      </w:r>
-      <w:r>
-        <w:rPr>
-          <w:lang w:val="ru-RU"/>
-        </w:rPr>
-        <w:t xml:space="preserve"> описує окремий процес отримання каталогу </w:t>
-      </w:r>
-      <w:r>
-        <w:t>model</w:t>
-      </w:r>
-      <w:r>
-        <w:rPr>
-          <w:lang w:val="ru-RU"/>
-        </w:rPr>
-        <w:t>. Це рішення має і практичний, і організаційний сенс: програмний код залишається легким для версіонування, а модельні артефакти керуються окремо.</w:t>
-      </w:r>
-    </w:p>
-    <w:p>
-      <w:pPr>
-        <w:rPr>
-          <w:lang w:val="ru-RU"/>
-        </w:rPr>
-      </w:pPr>
-      <w:r>
-        <w:rPr>
-          <w:lang w:val="ru-RU"/>
-        </w:rPr>
-        <w:t xml:space="preserve">Механізм </w:t>
-      </w:r>
-      <w:r>
-        <w:t>WebSocket</w:t>
-      </w:r>
-      <w:r>
-        <w:rPr>
-          <w:lang w:val="ru-RU"/>
-        </w:rPr>
-        <w:t xml:space="preserve">-оновлень є корисним не лише для зручності, а й для довіри до тривалих операцій. Якщо тренування займає кілька хвилин, користувач повинен бачити, що процес живий. Прогрес </w:t>
-      </w:r>
-      <w:r>
-        <w:t>training</w:t>
-      </w:r>
-      <w:r>
-        <w:rPr>
-          <w:lang w:val="ru-RU"/>
-        </w:rPr>
-        <w:t>_</w:t>
-      </w:r>
-      <w:r>
-        <w:t>progress</w:t>
-      </w:r>
-      <w:r>
-        <w:rPr>
-          <w:lang w:val="ru-RU"/>
-        </w:rPr>
-        <w:t xml:space="preserve"> і </w:t>
-      </w:r>
-      <w:r>
-        <w:t>evaluation</w:t>
-      </w:r>
-      <w:r>
-        <w:rPr>
-          <w:lang w:val="ru-RU"/>
-        </w:rPr>
-        <w:t>_</w:t>
-      </w:r>
-      <w:r>
-        <w:t>progress</w:t>
-      </w:r>
-      <w:r>
-        <w:rPr>
-          <w:lang w:val="ru-RU"/>
-        </w:rPr>
-        <w:t xml:space="preserve"> дає зворотний зв’язок і зменшує ймовірність примусового переривання процесу.</w:t>
-      </w:r>
-    </w:p>
-    <w:p>
-      <w:pPr>
-        <w:rPr>
-          <w:lang w:val="ru-RU"/>
-        </w:rPr>
-      </w:pPr>
-      <w:r>
-        <w:rPr>
-          <w:lang w:val="ru-RU"/>
-        </w:rPr>
-        <w:t xml:space="preserve">Оцінка зручності підтримки показує, що найскладнішою частиною системи є межа між </w:t>
-      </w:r>
-      <w:r>
-        <w:t>Windows</w:t>
-      </w:r>
-      <w:r>
-        <w:rPr>
-          <w:lang w:val="ru-RU"/>
-        </w:rPr>
-        <w:t xml:space="preserve"> і </w:t>
-      </w:r>
-      <w:r>
-        <w:t>WSL</w:t>
-      </w:r>
-      <w:r>
-        <w:rPr>
-          <w:lang w:val="ru-RU"/>
-        </w:rPr>
-        <w:t xml:space="preserve">2. Саме тут виникають проблеми шляхів, </w:t>
-      </w:r>
-      <w:r>
-        <w:t>callback</w:t>
-      </w:r>
-      <w:r>
-        <w:rPr>
-          <w:lang w:val="ru-RU"/>
-        </w:rPr>
-        <w:t xml:space="preserve">-адрес, доступності </w:t>
-      </w:r>
-      <w:r>
-        <w:t>Python</w:t>
-      </w:r>
-      <w:r>
-        <w:rPr>
-          <w:lang w:val="ru-RU"/>
-        </w:rPr>
-        <w:t xml:space="preserve"> і </w:t>
-      </w:r>
-      <w:r>
-        <w:t>GPU</w:t>
-      </w:r>
-      <w:r>
-        <w:rPr>
-          <w:lang w:val="ru-RU"/>
-        </w:rPr>
-        <w:t>. Допоміжні функції _</w:t>
-      </w:r>
-      <w:r>
-        <w:t>to</w:t>
-      </w:r>
-      <w:r>
-        <w:rPr>
-          <w:lang w:val="ru-RU"/>
-        </w:rPr>
-        <w:t>_</w:t>
-      </w:r>
-      <w:r>
-        <w:t>wsl</w:t>
-      </w:r>
-      <w:r>
-        <w:rPr>
-          <w:lang w:val="ru-RU"/>
-        </w:rPr>
-        <w:t xml:space="preserve"> та _</w:t>
-      </w:r>
-      <w:r>
-        <w:t>get</w:t>
-      </w:r>
-      <w:r>
-        <w:rPr>
-          <w:lang w:val="ru-RU"/>
-        </w:rPr>
-        <w:t>_</w:t>
-      </w:r>
-      <w:r>
-        <w:t>wsl</w:t>
-      </w:r>
-      <w:r>
-        <w:rPr>
-          <w:lang w:val="ru-RU"/>
-        </w:rPr>
-        <w:t>_</w:t>
-      </w:r>
-      <w:r>
-        <w:t>host</w:t>
-      </w:r>
-      <w:r>
-        <w:rPr>
-          <w:lang w:val="ru-RU"/>
-        </w:rPr>
-        <w:t>_</w:t>
-      </w:r>
-      <w:r>
-        <w:t>ip</w:t>
-      </w:r>
-      <w:r>
-        <w:rPr>
-          <w:lang w:val="ru-RU"/>
-        </w:rPr>
-        <w:t xml:space="preserve"> зменшують кількість ручних дій і роблять запуск тренування відтворюванішим.</w:t>
-      </w:r>
-    </w:p>
-    <w:p>
-      <w:pPr>
-        <w:rPr>
-          <w:lang w:val="ru-RU"/>
-        </w:rPr>
-      </w:pPr>
-      <w:r>
-        <w:rPr>
-          <w:lang w:val="ru-RU"/>
-        </w:rPr>
-        <w:t xml:space="preserve">Враховуючи локальність системи, важливою перевагою є приватність аналізованих текстів. Матеріали не залишають робочу станцію користувача, а отже можуть аналізуватися до публікації або в умовах внутрішньої редакційної роботи. Проте локальність переносить відповідальність за налаштування середовища на користувача, що обґрунтовує наявність </w:t>
-      </w:r>
-      <w:r>
-        <w:t>setup</w:t>
-      </w:r>
-      <w:r>
-        <w:rPr>
-          <w:lang w:val="ru-RU"/>
-        </w:rPr>
-        <w:t>.</w:t>
-      </w:r>
-      <w:r>
-        <w:t>cmd</w:t>
-      </w:r>
-      <w:r>
-        <w:rPr>
-          <w:lang w:val="ru-RU"/>
-        </w:rPr>
-        <w:t>.</w:t>
+        <w:t>Під час аналізу продуктивності важливо розрізняти холодний і повторний запуск моделі. Перший запит після створення моделі в Ollama включає завантаження ваг і адаптера, тому може бути помітно повільнішим за наступні звернення. Для коректної оцінки часу відповіді benchmark має фіксувати тип запуску, довжину тексту і параметри інференсу.</w:t>
+      </w:r>
+      <w:r/>
+      <w:r>
+        <w:rPr>
+          <w:lang w:val="ru-RU"/>
+        </w:rPr>
+      </w:r>
+      <w:r/>
+      <w:r>
+        <w:rPr>
+          <w:lang w:val="ru-RU"/>
+        </w:rPr>
+      </w:r>
+      <w:r/>
+      <w:r>
+        <w:rPr>
+          <w:lang w:val="ru-RU"/>
+        </w:rPr>
+      </w:r>
+    </w:p>
+    <w:p>
+      <w:pPr>
+        <w:rPr>
+          <w:lang w:val="ru-RU"/>
+        </w:rPr>
+      </w:pPr>
+      <w:r>
+        <w:rPr>
+          <w:lang w:val="ru-RU"/>
+        </w:rPr>
+        <w:t>Для інтерактивного сценарію більш важливою є не максимальна пропускна здатність, а передбачуваність очікування. Якщо аналіз одного матеріалу триває кілька секунд, frontend має показувати стан виконання і не створювати враження зависання. Це особливо важливо для експертного режиму, де тренування та оцінювання займають довше, ніж звичайний аналіз статті.</w:t>
+      </w:r>
+      <w:r/>
+      <w:r>
+        <w:rPr>
+          <w:lang w:val="ru-RU"/>
+        </w:rPr>
+      </w:r>
+      <w:r/>
+      <w:r>
+        <w:rPr>
+          <w:lang w:val="ru-RU"/>
+        </w:rPr>
+      </w:r>
+      <w:r/>
+      <w:r>
+        <w:rPr>
+          <w:lang w:val="ru-RU"/>
+        </w:rPr>
+      </w:r>
+      <w:r/>
+      <w:r>
+        <w:rPr>
+          <w:lang w:val="ru-RU"/>
+        </w:rPr>
+      </w:r>
+      <w:r/>
+      <w:r>
+        <w:rPr>
+          <w:lang w:val="ru-RU"/>
+        </w:rPr>
+      </w:r>
+    </w:p>
+    <w:p>
+      <w:pPr>
+        <w:rPr>
+          <w:lang w:val="ru-RU"/>
+        </w:rPr>
+      </w:pPr>
+      <w:r>
+        <w:rPr>
+          <w:lang w:val="ru-RU"/>
+        </w:rPr>
+        <w:t>Оцінка зручності супроводу показує, що найскладнішою частиною системи є межа між Windows і WSL2. Саме тут виникають проблеми шляхів, callback-адрес, доступності Python, драйверів GPU і сумісності ML-бібліотек. Допоміжні функції перетворення шляхів і визначення WSL-host адреси зменшують кількість ручних дій і роблять запуск тренування відтворюванішим.</w:t>
+      </w:r>
+      <w:r/>
+      <w:r>
+        <w:rPr>
+          <w:lang w:val="ru-RU"/>
+        </w:rPr>
+      </w:r>
+      <w:r/>
+      <w:r>
+        <w:rPr>
+          <w:lang w:val="ru-RU"/>
+        </w:rPr>
+      </w:r>
+      <w:r/>
+      <w:r>
+        <w:rPr>
+          <w:lang w:val="ru-RU"/>
+        </w:rPr>
+      </w:r>
+      <w:r/>
+      <w:r>
+        <w:rPr>
+          <w:lang w:val="ru-RU"/>
+        </w:rPr>
+      </w:r>
+      <w:r/>
+      <w:r>
+        <w:rPr>
+          <w:lang w:val="ru-RU"/>
+        </w:rPr>
+      </w:r>
+      <w:r/>
+      <w:r>
+        <w:rPr>
+          <w:lang w:val="ru-RU"/>
+        </w:rPr>
+      </w:r>
+      <w:r/>
+      <w:r>
+        <w:rPr>
+          <w:lang w:val="ru-RU"/>
+        </w:rPr>
+      </w:r>
+      <w:r/>
+      <w:r>
+        <w:rPr>
+          <w:lang w:val="ru-RU"/>
+        </w:rPr>
+      </w:r>
+      <w:r/>
+      <w:r>
+        <w:rPr>
+          <w:lang w:val="ru-RU"/>
+        </w:rPr>
+      </w:r>
+      <w:r/>
+      <w:r>
+        <w:rPr>
+          <w:lang w:val="ru-RU"/>
+        </w:rPr>
+      </w:r>
+      <w:r/>
+      <w:r>
+        <w:rPr>
+          <w:lang w:val="ru-RU"/>
+        </w:rPr>
+      </w:r>
+    </w:p>
+    <w:p>
+      <w:pPr>
+        <w:rPr>
+          <w:lang w:val="ru-RU"/>
+        </w:rPr>
+      </w:pPr>
+      <w:r>
+        <w:rPr>
+          <w:lang w:val="ru-RU"/>
+        </w:rPr>
+        <w:t>Для подальшої експлуатації доцільно додати короткий smoke-test після запуску run_app.cmd. Він має перевіряти доступність Ollama, backend endpoint /analyze, WebSocket експертної панелі та наявність активного адаптера. Така перевірка швидко відокремить помилки середовища від помилок моделі й спростить демонстрацію системи на іншій машині.</w:t>
+      </w:r>
+      <w:r/>
+      <w:r>
+        <w:rPr>
+          <w:lang w:val="ru-RU"/>
+        </w:rPr>
+      </w:r>
+      <w:r/>
+      <w:r>
+        <w:rPr>
+          <w:lang w:val="ru-RU"/>
+        </w:rPr>
       </w:r>
     </w:p>
     <w:p>
@@ -24596,577 +24422,430 @@
         <w:rPr>
           <w:lang w:val="ru-RU"/>
         </w:rPr>
-        <w:t xml:space="preserve">Усі ці напрями розвитку не змінюють базову архітектуру, а розширюють її. Це підтверджує, що вибране розділення на </w:t>
-      </w:r>
-      <w:r>
-        <w:t>frontend</w:t>
-      </w:r>
-      <w:r>
-        <w:rPr>
-          <w:lang w:val="ru-RU"/>
-        </w:rPr>
-        <w:t xml:space="preserve">, </w:t>
-      </w:r>
-      <w:r>
-        <w:t>backend</w:t>
-      </w:r>
-      <w:r>
-        <w:rPr>
-          <w:lang w:val="ru-RU"/>
-        </w:rPr>
-        <w:t xml:space="preserve">, </w:t>
-      </w:r>
-      <w:r>
-        <w:t>Ollama</w:t>
-      </w:r>
-      <w:r>
-        <w:rPr>
-          <w:lang w:val="ru-RU"/>
-        </w:rPr>
-        <w:t xml:space="preserve">, файлові артефакти моделі та </w:t>
-      </w:r>
-      <w:r>
-        <w:t>MLOps</w:t>
-      </w:r>
-      <w:r>
-        <w:rPr>
-          <w:lang w:val="ru-RU"/>
-        </w:rPr>
-        <w:t>-оркестратор є достатньо гнучким для подальшого ускладнення системи.</w:t>
-      </w:r>
-    </w:p>
-    <w:p>
-      <w:pPr>
-        <w:rPr>
-          <w:lang w:val="ru-RU"/>
-        </w:rPr>
-      </w:pPr>
-      <w:r>
-        <w:rPr>
-          <w:lang w:val="ru-RU"/>
-        </w:rPr>
-        <w:t xml:space="preserve">Отже, внесок роботи полягає не лише у побудові локального </w:t>
-      </w:r>
-      <w:r>
-        <w:t>LLM</w:t>
-      </w:r>
-      <w:r>
-        <w:rPr>
-          <w:lang w:val="ru-RU"/>
-        </w:rPr>
-        <w:t xml:space="preserve">-прототипу, а й у демонстрації того, що пояснюваність, структурна валідність і класифікаційна точність є різними вимірами якості. Надійна </w:t>
-      </w:r>
-      <w:r>
-        <w:lastRenderedPageBreak/>
-        <w:t>XAI</w:t>
-      </w:r>
-      <w:r>
-        <w:rPr>
-          <w:lang w:val="ru-RU"/>
-        </w:rPr>
-        <w:t xml:space="preserve">-система повинна вимірювати їх окремо, зберігати приклади помилок і підтримувати </w:t>
-      </w:r>
-      <w:r>
-        <w:t>MLOps</w:t>
-      </w:r>
-      <w:r>
-        <w:rPr>
-          <w:lang w:val="ru-RU"/>
-        </w:rPr>
-        <w:t xml:space="preserve">-цикл, у якому експерт може цілеспрямовано покращувати слабкі класи та якість </w:t>
-      </w:r>
-      <w:r>
-        <w:t>reasoning</w:t>
-      </w:r>
-      <w:r>
-        <w:rPr>
-          <w:lang w:val="ru-RU"/>
-        </w:rPr>
-        <w:t>.</w:t>
-      </w:r>
-    </w:p>
-    <w:p>
-      <w:pPr>
-        <w:rPr>
-          <w:lang w:val="ru-RU"/>
-        </w:rPr>
-      </w:pPr>
-      <w:r>
-        <w:rPr>
-          <w:lang w:val="ru-RU"/>
-        </w:rPr>
-        <w:t xml:space="preserve">Система показує, що пояснюваність у </w:t>
-      </w:r>
-      <w:r>
-        <w:t>LLM</w:t>
-      </w:r>
-      <w:r>
-        <w:rPr>
-          <w:lang w:val="ru-RU"/>
-        </w:rPr>
-        <w:t xml:space="preserve">-проєктах не є безкоштовною властивістю. Її потрібно забезпечувати даними, </w:t>
-      </w:r>
-      <w:r>
-        <w:t>prompt</w:t>
-      </w:r>
-      <w:r>
-        <w:rPr>
-          <w:lang w:val="ru-RU"/>
-        </w:rPr>
-        <w:t xml:space="preserve">, архітектурою відповіді, метриками і валідацією. Якщо будь-яка з цих частин слабка, </w:t>
-      </w:r>
-      <w:r>
-        <w:t>reasoning</w:t>
-      </w:r>
-      <w:r>
-        <w:rPr>
-          <w:lang w:val="ru-RU"/>
-        </w:rPr>
-        <w:t xml:space="preserve"> може стати декоративним текстом, який не покращує довіру. Тому подальша робота має оцінювати пояснення окремо від класифікаційних тегів.</w:t>
-      </w:r>
-    </w:p>
-    <w:p>
-      <w:pPr>
-        <w:rPr>
-          <w:lang w:val="ru-RU"/>
-        </w:rPr>
-      </w:pPr>
-      <w:r>
-        <w:rPr>
-          <w:lang w:val="ru-RU"/>
-        </w:rPr>
-        <w:t xml:space="preserve">Такий поступовий сценарій важливий, бо тематика дезінформації є чутливою. Перед широким використанням потрібно не тільки підвищити </w:t>
-      </w:r>
-      <w:r>
-        <w:t>F</w:t>
-      </w:r>
-      <w:r>
-        <w:rPr>
-          <w:lang w:val="ru-RU"/>
-        </w:rPr>
-        <w:t>1, а й переконатися, що система не створює необґрунтованих звинувачень, не перебільшує ризики і не приховує власну невпевненість. Саме тому технічні метрики мають доповнюватися експертним аналізом прикладів і чіткими попередженнями в інтерфейсі.</w:t>
-      </w:r>
-    </w:p>
-    <w:p>
-      <w:pPr>
-        <w:rPr>
-          <w:lang w:val="ru-RU"/>
-        </w:rPr>
-      </w:pPr>
-      <w:r>
-        <w:rPr>
-          <w:lang w:val="ru-RU"/>
-        </w:rPr>
-        <w:t xml:space="preserve">Важливим є також баланс між автоматизацією і відповідальністю. Якщо новий адаптер має кращу метрику на </w:t>
-      </w:r>
-      <w:r>
-        <w:t>benchmark</w:t>
-      </w:r>
-      <w:r>
-        <w:rPr>
-          <w:lang w:val="ru-RU"/>
-        </w:rPr>
-        <w:t xml:space="preserve">, це ще не гарантує кращу поведінку на всіх майбутніх текстах. Саме тому кнопка </w:t>
-      </w:r>
-      <w:r>
-        <w:t>promote</w:t>
-      </w:r>
-      <w:r>
-        <w:rPr>
-          <w:lang w:val="ru-RU"/>
-        </w:rPr>
-        <w:t xml:space="preserve"> винесена в експертний інтерфейс і супроводжується попередженням при погіршенні </w:t>
-      </w:r>
-      <w:r>
-        <w:t>F</w:t>
-      </w:r>
-      <w:r>
-        <w:rPr>
-          <w:lang w:val="ru-RU"/>
-        </w:rPr>
-        <w:t>1. Людина залишається останнім контролером змін.</w:t>
-      </w:r>
-    </w:p>
-    <w:p>
-      <w:pPr>
-        <w:rPr>
-          <w:lang w:val="ru-RU"/>
-        </w:rPr>
-      </w:pPr>
-      <w:r>
-        <w:rPr>
-          <w:lang w:val="ru-RU"/>
-        </w:rPr>
-        <w:t>Практичне використання системи має залишатися відповідальним. Порожній список тегів не є доказом правдивості тексту, а знайдена техніка не є юридичним або редакційним вироком. Система повинна використовуватися як інструмент підтримки аналітика, навчання медіаграмотності або попереднього сортування матеріалів. Остаточне рішення має приймати людина, особливо у чутливих інформаційних, політичних або репутаційних сценаріях.</w:t>
-      </w:r>
-    </w:p>
-    <w:p>
-      <w:pPr>
-        <w:rPr>
-          <w:lang w:val="ru-RU"/>
-        </w:rPr>
-      </w:pPr>
-      <w:r>
-        <w:rPr>
-          <w:lang w:val="ru-RU"/>
-        </w:rPr>
-        <w:t xml:space="preserve">Порівняння </w:t>
-      </w:r>
-      <w:r>
-        <w:t>Prototype</w:t>
-      </w:r>
-      <w:r>
-        <w:rPr>
-          <w:lang w:val="ru-RU"/>
-        </w:rPr>
-        <w:t xml:space="preserve"> </w:t>
-      </w:r>
-      <w:r>
-        <w:t>Adapter</w:t>
-      </w:r>
-      <w:r>
-        <w:rPr>
-          <w:lang w:val="ru-RU"/>
-        </w:rPr>
-        <w:t xml:space="preserve"> і </w:t>
-      </w:r>
-      <w:r>
-        <w:t>XAI</w:t>
-      </w:r>
-      <w:r>
-        <w:rPr>
-          <w:lang w:val="ru-RU"/>
-        </w:rPr>
-        <w:t xml:space="preserve"> </w:t>
-      </w:r>
-      <w:r>
-        <w:t>Adapter</w:t>
-      </w:r>
-      <w:r>
-        <w:rPr>
-          <w:lang w:val="ru-RU"/>
-        </w:rPr>
-        <w:t xml:space="preserve"> показує, що покращення одного аспекту поведінки може мати побічні ефекти. Адаптер, навчений давати пояснення, не автоматично стає кращим класифікатором. Це </w:t>
-      </w:r>
-      <w:r>
-        <w:rPr>
-          <w:lang w:val="ru-RU"/>
-        </w:rPr>
-        <w:lastRenderedPageBreak/>
-        <w:t xml:space="preserve">підкреслює необхідність </w:t>
-      </w:r>
-      <w:r>
-        <w:t>multi</w:t>
-      </w:r>
-      <w:r>
-        <w:rPr>
-          <w:lang w:val="ru-RU"/>
-        </w:rPr>
-        <w:t>-</w:t>
-      </w:r>
-      <w:r>
-        <w:t>objective</w:t>
-      </w:r>
-      <w:r>
-        <w:rPr>
-          <w:lang w:val="ru-RU"/>
-        </w:rPr>
-        <w:t xml:space="preserve"> оцінювання, де окремо враховуються структурна валідність, правильність тегів, якість </w:t>
-      </w:r>
-      <w:r>
-        <w:t>reasoning</w:t>
-      </w:r>
-      <w:r>
-        <w:rPr>
-          <w:lang w:val="ru-RU"/>
-        </w:rPr>
-        <w:t>, стабільність відповіді та практична корисність для користувача.</w:t>
-      </w:r>
-    </w:p>
-    <w:p>
-      <w:pPr>
-        <w:rPr>
-          <w:lang w:val="ru-RU"/>
-        </w:rPr>
-      </w:pPr>
-      <w:r>
-        <w:rPr>
-          <w:lang w:val="ru-RU"/>
-        </w:rPr>
-        <w:t xml:space="preserve">Важливо, що </w:t>
-      </w:r>
-      <w:r>
-        <w:t>XAI</w:t>
-      </w:r>
-      <w:r>
-        <w:rPr>
-          <w:lang w:val="ru-RU"/>
-        </w:rPr>
-        <w:t xml:space="preserve"> у цій роботі розглядається не тільки як властивість моделі, а як властивість повної системи. Пояснення має бути згенероване моделлю, передане </w:t>
-      </w:r>
-      <w:r>
-        <w:t>backend</w:t>
-      </w:r>
-      <w:r>
-        <w:rPr>
-          <w:lang w:val="ru-RU"/>
-        </w:rPr>
-        <w:t xml:space="preserve"> без втрати структури, локалізоване для інтерфейсу і показане користувачу у зрозумілому контексті. Якщо будь-який із цих етапів порушено, пояснюваність фактично не доходить до користувача.</w:t>
-      </w:r>
-    </w:p>
-    <w:p>
-      <w:pPr>
-        <w:rPr>
-          <w:lang w:val="ru-RU"/>
-        </w:rPr>
-      </w:pPr>
-      <w:r>
-        <w:rPr>
-          <w:lang w:val="ru-RU"/>
-        </w:rPr>
-        <w:t xml:space="preserve">Якість </w:t>
-      </w:r>
-      <w:r>
-        <w:t>NLE</w:t>
-      </w:r>
-      <w:r>
-        <w:rPr>
-          <w:lang w:val="ru-RU"/>
-        </w:rPr>
-        <w:t xml:space="preserve"> є окремим шаром оцінювання. Аудит навчального файлу підтверджує структурну контрольованість синтетичних пояснень: валідний </w:t>
-      </w:r>
-      <w:r>
-        <w:t>JSON</w:t>
-      </w:r>
-      <w:r>
-        <w:rPr>
-          <w:lang w:val="ru-RU"/>
-        </w:rPr>
-        <w:t xml:space="preserve">, непорожнє </w:t>
-      </w:r>
-      <w:r>
-        <w:t>reasoning</w:t>
-      </w:r>
-      <w:r>
-        <w:rPr>
-          <w:lang w:val="ru-RU"/>
-        </w:rPr>
-        <w:t xml:space="preserve">, відсутність невідомих тегів після нормалізації і відтворюваний розподіл 8136 нейтральних та 1767 маніпулятивних прикладів. Водночас цей аудит не доводить експертної семантичної правильності кожного пояснення, тому </w:t>
-      </w:r>
-      <w:r>
-        <w:t>NLE</w:t>
-      </w:r>
-      <w:r>
-        <w:rPr>
-          <w:lang w:val="ru-RU"/>
-        </w:rPr>
-        <w:t xml:space="preserve"> у роботі трактується як контрольований, але не повністю експертно валідований ресурс.</w:t>
-      </w:r>
-    </w:p>
-    <w:p>
-      <w:pPr>
-        <w:rPr>
-          <w:lang w:val="ru-RU"/>
-        </w:rPr>
-      </w:pPr>
-      <w:r>
-        <w:rPr>
-          <w:lang w:val="ru-RU"/>
-        </w:rPr>
-        <w:t xml:space="preserve">Окремий </w:t>
-      </w:r>
-      <w:r>
-        <w:t>error</w:t>
-      </w:r>
-      <w:r>
-        <w:rPr>
-          <w:lang w:val="ru-RU"/>
-        </w:rPr>
-        <w:t xml:space="preserve"> </w:t>
-      </w:r>
-      <w:r>
-        <w:t>analysis</w:t>
-      </w:r>
-      <w:r>
-        <w:rPr>
-          <w:lang w:val="ru-RU"/>
-        </w:rPr>
-        <w:t xml:space="preserve"> для </w:t>
-      </w:r>
-      <w:r>
-        <w:t>XAI</w:t>
-      </w:r>
-      <w:r>
-        <w:rPr>
-          <w:lang w:val="ru-RU"/>
-        </w:rPr>
-        <w:t xml:space="preserve"> </w:t>
-      </w:r>
-      <w:r>
-        <w:t>Adapter</w:t>
-      </w:r>
-      <w:r>
-        <w:rPr>
-          <w:lang w:val="ru-RU"/>
-        </w:rPr>
-        <w:t xml:space="preserve"> був необхідним, тому що агреговані метрики не пояснюють характер зниження </w:t>
-      </w:r>
-      <w:r>
-        <w:t>F</w:t>
-      </w:r>
-      <w:r>
-        <w:rPr>
-          <w:lang w:val="ru-RU"/>
-        </w:rPr>
-        <w:t xml:space="preserve">1. Вибірка з 30 непорожніх документів показала, що падіння формується не одним дефектом, а поєднанням </w:t>
-      </w:r>
-      <w:r>
-        <w:t>parse</w:t>
-      </w:r>
-      <w:r>
-        <w:rPr>
-          <w:lang w:val="ru-RU"/>
-        </w:rPr>
-        <w:t xml:space="preserve"> </w:t>
-      </w:r>
-      <w:r>
-        <w:t>failures</w:t>
-      </w:r>
-      <w:r>
-        <w:rPr>
-          <w:lang w:val="ru-RU"/>
-        </w:rPr>
-        <w:t xml:space="preserve">, консервативних </w:t>
-      </w:r>
-      <w:r>
-        <w:t>false</w:t>
-      </w:r>
-      <w:r>
-        <w:rPr>
-          <w:lang w:val="ru-RU"/>
-        </w:rPr>
-        <w:t xml:space="preserve"> </w:t>
-      </w:r>
-      <w:r>
-        <w:t>negatives</w:t>
-      </w:r>
-      <w:r>
-        <w:rPr>
-          <w:lang w:val="ru-RU"/>
-        </w:rPr>
-        <w:t xml:space="preserve">, неправильних тегів і часткових збігів. Особливо важливо, що частина відповідей має граматично прийнятне </w:t>
-      </w:r>
-      <w:r>
-        <w:t>reasoning</w:t>
-      </w:r>
-      <w:r>
-        <w:rPr>
-          <w:lang w:val="ru-RU"/>
-        </w:rPr>
-        <w:t xml:space="preserve">, але хибний або неповний список </w:t>
-      </w:r>
-      <w:r>
-        <w:t>discovered</w:t>
-      </w:r>
-      <w:r>
-        <w:rPr>
-          <w:lang w:val="ru-RU"/>
-        </w:rPr>
-        <w:t>_</w:t>
-      </w:r>
-      <w:r>
-        <w:t>techniques</w:t>
-      </w:r>
-      <w:r>
-        <w:rPr>
-          <w:lang w:val="ru-RU"/>
-        </w:rPr>
-        <w:t>.</w:t>
-      </w:r>
-    </w:p>
-    <w:p>
-      <w:pPr>
-        <w:rPr>
-          <w:lang w:val="ru-RU"/>
-        </w:rPr>
-      </w:pPr>
-      <w:r>
-        <w:rPr>
-          <w:lang w:val="ru-RU"/>
-        </w:rPr>
-        <w:t xml:space="preserve">Результати експериментів показують головний компроміс роботи: додавання природномовного пояснення підвищує інтерпретованість відповіді, але не гарантує зростання класифікаційної якості. </w:t>
-      </w:r>
-      <w:r>
-        <w:t>Prototype</w:t>
-      </w:r>
-      <w:r>
-        <w:rPr>
-          <w:lang w:val="ru-RU"/>
-        </w:rPr>
-        <w:t xml:space="preserve"> </w:t>
-      </w:r>
-      <w:r>
-        <w:t>Adapter</w:t>
-      </w:r>
-      <w:r>
-        <w:rPr>
-          <w:lang w:val="ru-RU"/>
-        </w:rPr>
-        <w:t xml:space="preserve"> досяг </w:t>
-      </w:r>
-      <w:r>
-        <w:t>F</w:t>
-      </w:r>
-      <w:r>
-        <w:rPr>
-          <w:lang w:val="ru-RU"/>
-        </w:rPr>
-        <w:t xml:space="preserve">1 = 0,4912 на непорожніх документах, тоді як </w:t>
-      </w:r>
-      <w:r>
-        <w:t>XAI</w:t>
-      </w:r>
-      <w:r>
-        <w:rPr>
-          <w:lang w:val="ru-RU"/>
-        </w:rPr>
-        <w:t xml:space="preserve"> </w:t>
-      </w:r>
-      <w:r>
-        <w:t>Adapter</w:t>
-      </w:r>
-      <w:r>
-        <w:rPr>
-          <w:lang w:val="ru-RU"/>
-        </w:rPr>
-        <w:t xml:space="preserve"> з </w:t>
-      </w:r>
-      <w:r>
-        <w:t>reasoning</w:t>
-      </w:r>
-      <w:r>
-        <w:rPr>
-          <w:lang w:val="ru-RU"/>
-        </w:rPr>
-        <w:t xml:space="preserve"> знизився до </w:t>
-      </w:r>
-      <w:r>
-        <w:t>F</w:t>
-      </w:r>
-      <w:r>
-        <w:rPr>
-          <w:lang w:val="ru-RU"/>
-        </w:rPr>
-        <w:t xml:space="preserve">1 = 0,2847. Це не скасовує цінність </w:t>
-      </w:r>
-      <w:r>
-        <w:t>XAI</w:t>
-      </w:r>
-      <w:r>
-        <w:rPr>
-          <w:lang w:val="ru-RU"/>
-        </w:rPr>
-        <w:t>, але показує, що пояснюваність має власну вартість і потребує окремої оптимізації.</w:t>
+        <w:t>Додатковий аналіз впровадження показує, що роботу доцільно оцінювати не лише за метриками моделі, а й за простежуваністю виконаних інженерних задач. Для цього можна скласти матрицю відповідності між завданнями кваліфікаційної роботи, реалізованими модулями, тестами, експериментальними звітами та рисунками у пояснювальній записці. Така матриця допоможе під час захисту показати, що кожна заявлена задача має конкретний результат.</w:t>
+      </w:r>
+      <w:r/>
+      <w:r>
+        <w:rPr>
+          <w:lang w:val="ru-RU"/>
+        </w:rPr>
+      </w:r>
+      <w:r/>
+      <w:r>
+        <w:rPr>
+          <w:lang w:val="ru-RU"/>
+        </w:rPr>
+      </w:r>
+      <w:r/>
+      <w:r>
+        <w:rPr>
+          <w:lang w:val="ru-RU"/>
+        </w:rPr>
+      </w:r>
+      <w:r/>
+      <w:r>
+        <w:rPr>
+          <w:lang w:val="ru-RU"/>
+        </w:rPr>
+      </w:r>
+    </w:p>
+    <w:p>
+      <w:pPr>
+        <w:rPr>
+          <w:lang w:val="ru-RU"/>
+        </w:rPr>
+      </w:pPr>
+      <w:r>
+        <w:rPr>
+          <w:lang w:val="ru-RU"/>
+        </w:rPr>
+        <w:t>З операційного погляду система має щонайменше три ролі: звичайний користувач аналізує текст, експерт керує датасетами й адаптерами, а адміністратор відповідає за середовище виконання. У прототипі ці ролі частково збігаються, але їхнє розмежування корисне для майбутнього розвитку, оскільки різні дії мають різний рівень ризику.</w:t>
+      </w:r>
+      <w:r/>
+      <w:r>
+        <w:rPr>
+          <w:lang w:val="ru-RU"/>
+        </w:rPr>
+      </w:r>
+      <w:r/>
+      <w:r>
+        <w:rPr>
+          <w:lang w:val="ru-RU"/>
+        </w:rPr>
+      </w:r>
+      <w:r/>
+      <w:r>
+        <w:rPr>
+          <w:lang w:val="ru-RU"/>
+        </w:rPr>
+      </w:r>
+      <w:r/>
+      <w:r>
+        <w:rPr>
+          <w:lang w:val="ru-RU"/>
+        </w:rPr>
+      </w:r>
+    </w:p>
+    <w:p>
+      <w:pPr>
+        <w:rPr>
+          <w:lang w:val="ru-RU"/>
+        </w:rPr>
+      </w:pPr>
+      <w:r>
+        <w:rPr>
+          <w:lang w:val="ru-RU"/>
+        </w:rPr>
+        <w:t>Для керування моделями доцільно запровадити життєвий цикл версії: candidate, evaluated, promoted, rejected і archived. Candidate-адаптер створюється після тренування, evaluated має benchmark-звіт, promoted стає активним у Modelfile, rejected зберігається лише для аналізу помилок, а archived може бути використаний для rollback. Такий підхід робить MLOps-процес контрольованішим.</w:t>
+      </w:r>
+      <w:r/>
+      <w:r>
+        <w:rPr>
+          <w:lang w:val="ru-RU"/>
+        </w:rPr>
+      </w:r>
+      <w:r/>
+      <w:r>
+        <w:rPr>
+          <w:lang w:val="ru-RU"/>
+        </w:rPr>
+      </w:r>
+      <w:r/>
+      <w:r>
+        <w:rPr>
+          <w:lang w:val="ru-RU"/>
+        </w:rPr>
+      </w:r>
+    </w:p>
+    <w:p>
+      <w:pPr>
+        <w:rPr>
+          <w:lang w:val="ru-RU"/>
+        </w:rPr>
+      </w:pPr>
+      <w:r>
+        <w:rPr>
+          <w:lang w:val="ru-RU"/>
+        </w:rPr>
+        <w:t>Окремим елементом впровадження є процедура підготовки нових навчальних прикладів. Експертні виправлення мають проходити валідацію формату, перевірку допустимих тегів, очищення службових або персональних даних і короткий перегляд узгодженості між текстом, мітками та поясненням. Це зменшує ризик того, що локальне донавчання погіршить модель через неякісний корпус.</w:t>
+      </w:r>
+      <w:r/>
+      <w:r>
+        <w:rPr>
+          <w:lang w:val="ru-RU"/>
+        </w:rPr>
+      </w:r>
+    </w:p>
+    <w:p>
+      <w:pPr>
+        <w:rPr>
+          <w:lang w:val="ru-RU"/>
+        </w:rPr>
+      </w:pPr>
+      <w:r>
+        <w:rPr>
+          <w:lang w:val="ru-RU"/>
+        </w:rPr>
+        <w:t>Валідність експериментальних висновків має власні обмеження. Тестовий набір MIPD відображає конкретну мову, домен і таксономію, тому результати не можна автоматично переносити на всі медіатексти. Крім того, велика частка нейтральних документів впливає на Exact-Match, а синтетичні пояснення не дорівнюють експертним rationale. Ці фактори потрібно прямо враховувати при інтерпретації метрик.</w:t>
+      </w:r>
+      <w:r/>
+      <w:r>
+        <w:rPr>
+          <w:lang w:val="ru-RU"/>
+        </w:rPr>
+      </w:r>
+      <w:r/>
+      <w:r>
+        <w:rPr>
+          <w:lang w:val="ru-RU"/>
+        </w:rPr>
+      </w:r>
+      <w:r/>
+      <w:r>
+        <w:rPr>
+          <w:lang w:val="ru-RU"/>
+        </w:rPr>
+      </w:r>
+    </w:p>
+    <w:p>
+      <w:pPr>
+        <w:rPr>
+          <w:lang w:val="ru-RU"/>
+        </w:rPr>
+      </w:pPr>
+      <w:r>
+        <w:rPr>
+          <w:lang w:val="ru-RU"/>
+        </w:rPr>
+        <w:t>Корисним артефактом наступної ітерації може бути каталог типових помилок. Для кожної групи варто зберігати короткий приклад, gold labels, прогноз моделі, тип дефекту і можливу причину. Такий каталог перетворює error analysis із разового опису на робочий інструмент планування нових даних і regression-тестів.</w:t>
+      </w:r>
+    </w:p>
+    <w:p>
+      <w:pPr>
+        <w:rPr>
+          <w:lang w:val="ru-RU"/>
+        </w:rPr>
+      </w:pPr>
+      <w:r>
+        <w:rPr>
+          <w:lang w:val="ru-RU"/>
+        </w:rPr>
+        <w:t>Після впровадження важливо контролювати не самі тексти користувачів, а агреговані технічні показники: частку помилок обробки, середній час відповіді, кількість невідомих тегів, частку порожніх результатів і частоту ручних виправлень експерта. Такі сигнали можуть вказувати на дрейф даних або невдалу версію адаптера без збереження зайвого вмісту користувацьких матеріалів.</w:t>
+      </w:r>
+      <w:r/>
+      <w:r>
+        <w:rPr>
+          <w:lang w:val="ru-RU"/>
+        </w:rPr>
+      </w:r>
+      <w:r/>
+      <w:r>
+        <w:rPr>
+          <w:lang w:val="ru-RU"/>
+        </w:rPr>
+      </w:r>
+      <w:r/>
+      <w:r>
+        <w:rPr>
+          <w:lang w:val="ru-RU"/>
+        </w:rPr>
+      </w:r>
+      <w:r/>
+      <w:r>
+        <w:rPr>
+          <w:lang w:val="ru-RU"/>
+        </w:rPr>
+      </w:r>
+      <w:r>
+        <w:rPr>
+          <w:lang w:val="ru-RU"/>
+        </w:rPr>
+      </w:r>
+      <w:r/>
+      <w:r>
+        <w:rPr>
+          <w:lang w:val="ru-RU"/>
+        </w:rPr>
+      </w:r>
+      <w:r/>
+      <w:r>
+        <w:rPr>
+          <w:lang w:val="ru-RU"/>
+        </w:rPr>
+      </w:r>
+      <w:r/>
+      <w:r>
+        <w:rPr>
+          <w:lang w:val="ru-RU"/>
+        </w:rPr>
+      </w:r>
+    </w:p>
+    <w:p>
+      <w:pPr>
+        <w:rPr>
+          <w:lang w:val="ru-RU"/>
+        </w:rPr>
+      </w:pPr>
+      <w:r>
+        <w:rPr>
+          <w:lang w:val="ru-RU"/>
+        </w:rPr>
+        <w:t>Практична експлуатація потребує явних правил зберігання даних. Для навчального режиму достатньо тимчасового збереження прикладів, тоді як редакційний сценарій може вимагати строків зберігання, права видалення матеріалів і відокремлення журналів від навчального корпусу. Це організаційне рішення має бути прийняте до використання системи з реальними чутливими текстами.</w:t>
+      </w:r>
+      <w:r/>
+      <w:r>
+        <w:rPr>
+          <w:lang w:val="ru-RU"/>
+        </w:rPr>
+      </w:r>
+      <w:r/>
+      <w:r>
+        <w:rPr>
+          <w:lang w:val="ru-RU"/>
+        </w:rPr>
+      </w:r>
+    </w:p>
+    <w:p>
+      <w:pPr>
+        <w:rPr>
+          <w:lang w:val="ru-RU"/>
+        </w:rPr>
+      </w:pPr>
+      <w:r>
+        <w:rPr>
+          <w:lang w:val="ru-RU"/>
+        </w:rPr>
+        <w:t>Перед передачею системи іншому користувачу доцільно мати короткий checklist готовності: встановлено Ollama, доступний потрібний GGUF-файл, створено backend/.venv і .venv-wsl, відкриваються порти backend і frontend, проходить тестовий /analyze-запит, а baseline-звіт відповідає активному адаптеру. Такий список краще відповідає практичному характеру роботи, ніж лише опис архітектури.</w:t>
+      </w:r>
+      <w:r/>
+      <w:r>
+        <w:rPr>
+          <w:lang w:val="ru-RU"/>
+        </w:rPr>
+      </w:r>
+      <w:r/>
+      <w:r>
+        <w:rPr>
+          <w:lang w:val="ru-RU"/>
+        </w:rPr>
+      </w:r>
+      <w:r/>
+      <w:r>
+        <w:rPr>
+          <w:lang w:val="ru-RU"/>
+        </w:rPr>
+      </w:r>
+      <w:r/>
+      <w:r>
+        <w:rPr>
+          <w:lang w:val="ru-RU"/>
+        </w:rPr>
+      </w:r>
+    </w:p>
+    <w:p>
+      <w:pPr>
+        <w:rPr>
+          <w:lang w:val="ru-RU"/>
+        </w:rPr>
+      </w:pPr>
+      <w:r>
+        <w:rPr>
+          <w:lang w:val="ru-RU"/>
+        </w:rPr>
+        <w:t>У навчальному процесі система може використовуватися як лабораторний приклад повного LLM-життєвого циклу. Студент може простежити шлях від датасету і синтетичних пояснень до адаптера, API, frontend-відображення, benchmark-звіту і рішення про розгортання. Саме така наскрізна демонстрація відповідає вимозі показати не тільки теоретичну основу, а й практичний стан розробки.</w:t>
+      </w:r>
+      <w:r/>
+      <w:r>
+        <w:rPr>
+          <w:lang w:val="ru-RU"/>
+        </w:rPr>
+      </w:r>
+      <w:r/>
+      <w:r>
+        <w:rPr>
+          <w:lang w:val="ru-RU"/>
+        </w:rPr>
+      </w:r>
+      <w:r/>
+      <w:r>
+        <w:rPr>
+          <w:lang w:val="ru-RU"/>
+        </w:rPr>
+      </w:r>
+      <w:r/>
+      <w:r>
+        <w:rPr>
+          <w:lang w:val="ru-RU"/>
+        </w:rPr>
+      </w:r>
+      <w:r/>
+      <w:r>
+        <w:rPr>
+          <w:lang w:val="ru-RU"/>
+        </w:rPr>
+      </w:r>
+      <w:r/>
+      <w:r>
+        <w:rPr>
+          <w:lang w:val="ru-RU"/>
+        </w:rPr>
+      </w:r>
+      <w:r/>
+      <w:r>
+        <w:rPr>
+          <w:lang w:val="ru-RU"/>
+        </w:rPr>
+      </w:r>
+      <w:r/>
+      <w:r>
+        <w:rPr>
+          <w:lang w:val="ru-RU"/>
+        </w:rPr>
+      </w:r>
+      <w:r/>
+      <w:r>
+        <w:rPr>
+          <w:lang w:val="ru-RU"/>
+        </w:rPr>
+      </w:r>
+      <w:r/>
+      <w:r>
+        <w:rPr>
+          <w:lang w:val="ru-RU"/>
+        </w:rPr>
+      </w:r>
+      <w:r/>
+      <w:r>
+        <w:rPr>
+          <w:lang w:val="ru-RU"/>
+        </w:rPr>
+      </w:r>
+      <w:r/>
+      <w:r>
+        <w:rPr>
+          <w:lang w:val="ru-RU"/>
+        </w:rPr>
+      </w:r>
+    </w:p>
+    <w:p>
+      <w:pPr>
+        <w:rPr>
+          <w:lang w:val="ru-RU"/>
+        </w:rPr>
+      </w:pPr>
+      <w:r>
+        <w:rPr>
+          <w:lang w:val="ru-RU"/>
+        </w:rPr>
+        <w:t>Таким чином, додатковий аналіз впровадження уточнює перехід від дослідного прототипу до контрольованого інструмента. Подальша цінність системи залежить не лише від підвищення F1, а й від якості даних, трасованості версій, прозорих процедур експертного рішення, відтворюваних експериментів і зрозумілих обмежень для користувача.</w:t>
+      </w:r>
+      <w:r/>
+      <w:r>
+        <w:rPr>
+          <w:lang w:val="ru-RU"/>
+        </w:rPr>
+      </w:r>
+      <w:r/>
+      <w:r>
+        <w:rPr>
+          <w:lang w:val="ru-RU"/>
+        </w:rPr>
+      </w:r>
+      <w:r/>
+      <w:r>
+        <w:rPr>
+          <w:lang w:val="ru-RU"/>
+        </w:rPr>
+      </w:r>
+      <w:r/>
+      <w:r>
+        <w:rPr>
+          <w:lang w:val="ru-RU"/>
+        </w:rPr>
+      </w:r>
+      <w:r/>
+      <w:r>
+        <w:rPr>
+          <w:lang w:val="ru-RU"/>
+        </w:rPr>
+      </w:r>
+      <w:r/>
+      <w:r>
+        <w:rPr>
+          <w:lang w:val="ru-RU"/>
+        </w:rPr>
+      </w:r>
+      <w:r/>
+      <w:r>
+        <w:rPr>
+          <w:lang w:val="ru-RU"/>
+        </w:rPr>
+      </w:r>
+      <w:r/>
+      <w:r>
+        <w:rPr>
+          <w:lang w:val="ru-RU"/>
+        </w:rPr>
       </w:r>
     </w:p>
     <w:p>

</xml_diff>